<commit_message>
Se modifican documentos: Ficha de Evaluación, Plan de Tesis, Informe Final.
</commit_message>
<xml_diff>
--- a/Ficha_Evaluacion_Tesis_Mamani_Bedregal.docx
+++ b/Ficha_Evaluacion_Tesis_Mamani_Bedregal.docx
@@ -527,7 +527,23 @@
                 <w:sz w:val="20"/>
                 <w:szCs w:val="20"/>
               </w:rPr>
-              <w:t>identificador utilizado por el personal para autenticarse es otorgado fácilmente.</w:t>
+              <w:t xml:space="preserve">identificador utilizado por el personal para autenticarse es </w:t>
+            </w:r>
+            <w:r>
+              <w:rPr>
+                <w:rFonts w:ascii="Arial" w:hAnsi="Arial" w:cs="Arial"/>
+                <w:sz w:val="20"/>
+                <w:szCs w:val="20"/>
+              </w:rPr>
+              <w:t>de fácil uso</w:t>
+            </w:r>
+            <w:r>
+              <w:rPr>
+                <w:rFonts w:ascii="Arial" w:hAnsi="Arial" w:cs="Arial"/>
+                <w:sz w:val="20"/>
+                <w:szCs w:val="20"/>
+              </w:rPr>
+              <w:t>.</w:t>
             </w:r>
           </w:p>
         </w:tc>
@@ -961,151 +977,6 @@
           </w:p>
         </w:tc>
       </w:tr>
-      <w:tr>
-        <w:tc>
-          <w:tcPr>
-            <w:tcW w:w="6023" w:type="dxa"/>
-          </w:tcPr>
-          <w:p>
-            <w:pPr>
-              <w:pStyle w:val="Prrafodelista"/>
-              <w:numPr>
-                <w:ilvl w:val="0"/>
-                <w:numId w:val="37"/>
-              </w:numPr>
-              <w:jc w:val="both"/>
-              <w:rPr>
-                <w:rFonts w:ascii="Arial" w:hAnsi="Arial" w:cs="Arial"/>
-                <w:sz w:val="20"/>
-                <w:szCs w:val="20"/>
-              </w:rPr>
-            </w:pPr>
-            <w:r>
-              <w:rPr>
-                <w:rFonts w:ascii="Arial" w:hAnsi="Arial" w:cs="Arial"/>
-                <w:sz w:val="20"/>
-                <w:szCs w:val="20"/>
-              </w:rPr>
-              <w:t>Existen fallos en el proceso de identificación del personal.</w:t>
-            </w:r>
-          </w:p>
-        </w:tc>
-        <w:tc>
-          <w:tcPr>
-            <w:tcW w:w="420" w:type="dxa"/>
-          </w:tcPr>
-          <w:p>
-            <w:pPr>
-              <w:jc w:val="center"/>
-              <w:rPr>
-                <w:rFonts w:ascii="Arial" w:hAnsi="Arial" w:cs="Arial"/>
-                <w:sz w:val="20"/>
-                <w:szCs w:val="20"/>
-              </w:rPr>
-            </w:pPr>
-            <w:r>
-              <w:rPr>
-                <w:rFonts w:ascii="Arial" w:hAnsi="Arial" w:cs="Arial"/>
-                <w:sz w:val="20"/>
-                <w:szCs w:val="20"/>
-              </w:rPr>
-              <w:t>5</w:t>
-            </w:r>
-          </w:p>
-        </w:tc>
-        <w:tc>
-          <w:tcPr>
-            <w:tcW w:w="650" w:type="dxa"/>
-          </w:tcPr>
-          <w:p>
-            <w:pPr>
-              <w:jc w:val="center"/>
-              <w:rPr>
-                <w:rFonts w:ascii="Arial" w:hAnsi="Arial" w:cs="Arial"/>
-                <w:sz w:val="20"/>
-                <w:szCs w:val="20"/>
-              </w:rPr>
-            </w:pPr>
-            <w:r>
-              <w:rPr>
-                <w:rFonts w:ascii="Arial" w:hAnsi="Arial" w:cs="Arial"/>
-                <w:sz w:val="20"/>
-                <w:szCs w:val="20"/>
-              </w:rPr>
-              <w:t>4</w:t>
-            </w:r>
-          </w:p>
-        </w:tc>
-        <w:tc>
-          <w:tcPr>
-            <w:tcW w:w="494" w:type="dxa"/>
-          </w:tcPr>
-          <w:p>
-            <w:pPr>
-              <w:jc w:val="center"/>
-              <w:rPr>
-                <w:rFonts w:ascii="Arial" w:hAnsi="Arial" w:cs="Arial"/>
-                <w:sz w:val="20"/>
-                <w:szCs w:val="20"/>
-              </w:rPr>
-            </w:pPr>
-            <w:r>
-              <w:rPr>
-                <w:rFonts w:ascii="Arial" w:hAnsi="Arial" w:cs="Arial"/>
-                <w:sz w:val="20"/>
-                <w:szCs w:val="20"/>
-              </w:rPr>
-              <w:t>3</w:t>
-            </w:r>
-          </w:p>
-        </w:tc>
-        <w:tc>
-          <w:tcPr>
-            <w:tcW w:w="494" w:type="dxa"/>
-          </w:tcPr>
-          <w:p>
-            <w:pPr>
-              <w:jc w:val="center"/>
-              <w:rPr>
-                <w:rFonts w:ascii="Arial" w:hAnsi="Arial" w:cs="Arial"/>
-                <w:sz w:val="20"/>
-                <w:szCs w:val="20"/>
-              </w:rPr>
-            </w:pPr>
-            <w:r>
-              <w:rPr>
-                <w:rFonts w:ascii="Arial" w:hAnsi="Arial" w:cs="Arial"/>
-                <w:sz w:val="20"/>
-                <w:szCs w:val="20"/>
-              </w:rPr>
-              <w:t>2</w:t>
-            </w:r>
-          </w:p>
-        </w:tc>
-        <w:tc>
-          <w:tcPr>
-            <w:tcW w:w="413" w:type="dxa"/>
-          </w:tcPr>
-          <w:p>
-            <w:pPr>
-              <w:jc w:val="center"/>
-              <w:rPr>
-                <w:rFonts w:ascii="Arial" w:hAnsi="Arial" w:cs="Arial"/>
-                <w:sz w:val="20"/>
-                <w:szCs w:val="20"/>
-              </w:rPr>
-            </w:pPr>
-            <w:r>
-              <w:rPr>
-                <w:rFonts w:ascii="Arial" w:hAnsi="Arial" w:cs="Arial"/>
-                <w:sz w:val="20"/>
-                <w:szCs w:val="20"/>
-              </w:rPr>
-              <w:t>1</w:t>
-            </w:r>
-          </w:p>
-        </w:tc>
-      </w:tr>
     </w:tbl>
     <w:p>
       <w:pPr>
@@ -1144,7 +1015,7 @@
           <w:sz w:val="20"/>
           <w:szCs w:val="20"/>
         </w:rPr>
-        <w:t>*Enunciados Directos: 1,2,3 *Enunciados Indirectos: 4</w:t>
+        <w:t>*Enunciados Directos: 1,2,3</w:t>
       </w:r>
     </w:p>
     <w:p>
@@ -1646,151 +1517,23 @@
                 <w:sz w:val="20"/>
                 <w:szCs w:val="20"/>
               </w:rPr>
-              <w:t>Existen aciertos incorrectos en la autenticación del personal.</w:t>
-            </w:r>
-          </w:p>
-        </w:tc>
-        <w:tc>
-          <w:tcPr>
-            <w:tcW w:w="420" w:type="dxa"/>
-          </w:tcPr>
-          <w:p>
-            <w:pPr>
-              <w:jc w:val="center"/>
-              <w:rPr>
-                <w:rFonts w:ascii="Arial" w:hAnsi="Arial" w:cs="Arial"/>
-                <w:sz w:val="20"/>
-                <w:szCs w:val="20"/>
-              </w:rPr>
-            </w:pPr>
-            <w:r>
-              <w:rPr>
-                <w:rFonts w:ascii="Arial" w:hAnsi="Arial" w:cs="Arial"/>
-                <w:sz w:val="20"/>
-                <w:szCs w:val="20"/>
-              </w:rPr>
-              <w:t>5</w:t>
-            </w:r>
-          </w:p>
-        </w:tc>
-        <w:tc>
-          <w:tcPr>
-            <w:tcW w:w="650" w:type="dxa"/>
-          </w:tcPr>
-          <w:p>
-            <w:pPr>
-              <w:jc w:val="center"/>
-              <w:rPr>
-                <w:rFonts w:ascii="Arial" w:hAnsi="Arial" w:cs="Arial"/>
-                <w:sz w:val="20"/>
-                <w:szCs w:val="20"/>
-              </w:rPr>
-            </w:pPr>
-            <w:r>
-              <w:rPr>
-                <w:rFonts w:ascii="Arial" w:hAnsi="Arial" w:cs="Arial"/>
-                <w:sz w:val="20"/>
-                <w:szCs w:val="20"/>
-              </w:rPr>
-              <w:t>4</w:t>
-            </w:r>
-          </w:p>
-        </w:tc>
-        <w:tc>
-          <w:tcPr>
-            <w:tcW w:w="494" w:type="dxa"/>
-          </w:tcPr>
-          <w:p>
-            <w:pPr>
-              <w:jc w:val="center"/>
-              <w:rPr>
-                <w:rFonts w:ascii="Arial" w:hAnsi="Arial" w:cs="Arial"/>
-                <w:sz w:val="20"/>
-                <w:szCs w:val="20"/>
-              </w:rPr>
-            </w:pPr>
-            <w:r>
-              <w:rPr>
-                <w:rFonts w:ascii="Arial" w:hAnsi="Arial" w:cs="Arial"/>
-                <w:sz w:val="20"/>
-                <w:szCs w:val="20"/>
-              </w:rPr>
-              <w:t>3</w:t>
-            </w:r>
-          </w:p>
-        </w:tc>
-        <w:tc>
-          <w:tcPr>
-            <w:tcW w:w="494" w:type="dxa"/>
-          </w:tcPr>
-          <w:p>
-            <w:pPr>
-              <w:jc w:val="center"/>
-              <w:rPr>
-                <w:rFonts w:ascii="Arial" w:hAnsi="Arial" w:cs="Arial"/>
-                <w:sz w:val="20"/>
-                <w:szCs w:val="20"/>
-              </w:rPr>
-            </w:pPr>
-            <w:r>
-              <w:rPr>
-                <w:rFonts w:ascii="Arial" w:hAnsi="Arial" w:cs="Arial"/>
-                <w:sz w:val="20"/>
-                <w:szCs w:val="20"/>
-              </w:rPr>
-              <w:t>2</w:t>
-            </w:r>
-          </w:p>
-        </w:tc>
-        <w:tc>
-          <w:tcPr>
-            <w:tcW w:w="413" w:type="dxa"/>
-          </w:tcPr>
-          <w:p>
-            <w:pPr>
-              <w:jc w:val="center"/>
-              <w:rPr>
-                <w:rFonts w:ascii="Arial" w:hAnsi="Arial" w:cs="Arial"/>
-                <w:sz w:val="20"/>
-                <w:szCs w:val="20"/>
-              </w:rPr>
-            </w:pPr>
-            <w:r>
-              <w:rPr>
-                <w:rFonts w:ascii="Arial" w:hAnsi="Arial" w:cs="Arial"/>
-                <w:sz w:val="20"/>
-                <w:szCs w:val="20"/>
-              </w:rPr>
-              <w:t>1</w:t>
-            </w:r>
-          </w:p>
-        </w:tc>
-      </w:tr>
-      <w:tr>
-        <w:tc>
-          <w:tcPr>
-            <w:tcW w:w="6023" w:type="dxa"/>
-          </w:tcPr>
-          <w:p>
-            <w:pPr>
-              <w:pStyle w:val="Prrafodelista"/>
-              <w:numPr>
-                <w:ilvl w:val="0"/>
-                <w:numId w:val="37"/>
-              </w:numPr>
-              <w:rPr>
-                <w:rFonts w:ascii="Arial" w:hAnsi="Arial" w:cs="Arial"/>
-                <w:sz w:val="20"/>
-                <w:szCs w:val="20"/>
-              </w:rPr>
-            </w:pPr>
-            <w:r>
-              <w:rPr>
-                <w:rFonts w:ascii="Arial" w:hAnsi="Arial" w:cs="Arial"/>
-                <w:sz w:val="20"/>
-                <w:szCs w:val="20"/>
-              </w:rPr>
-              <w:t>Existen fallos en el proceso de autenticación del personal.</w:t>
+              <w:t xml:space="preserve">Existen </w:t>
+            </w:r>
+            <w:r>
+              <w:rPr>
+                <w:rFonts w:ascii="Arial" w:hAnsi="Arial" w:cs="Arial"/>
+                <w:sz w:val="20"/>
+                <w:szCs w:val="20"/>
+              </w:rPr>
+              <w:t>falsos positivos</w:t>
+            </w:r>
+            <w:r>
+              <w:rPr>
+                <w:rFonts w:ascii="Arial" w:hAnsi="Arial" w:cs="Arial"/>
+                <w:sz w:val="20"/>
+                <w:szCs w:val="20"/>
+              </w:rPr>
+              <w:t xml:space="preserve"> en la autenticación del personal.</w:t>
             </w:r>
           </w:p>
         </w:tc>
@@ -1948,7 +1691,52 @@
           <w:sz w:val="20"/>
           <w:szCs w:val="20"/>
         </w:rPr>
-        <w:t>*Enunciados Directos: 5,6 *Enunciados Indirectos: 7,8</w:t>
+        <w:t xml:space="preserve">*Enunciados Directos: </w:t>
+      </w:r>
+      <w:r>
+        <w:rPr>
+          <w:rFonts w:ascii="Arial" w:hAnsi="Arial" w:cs="Arial"/>
+          <w:b/>
+          <w:sz w:val="20"/>
+          <w:szCs w:val="20"/>
+        </w:rPr>
+        <w:t>4</w:t>
+      </w:r>
+      <w:r>
+        <w:rPr>
+          <w:rFonts w:ascii="Arial" w:hAnsi="Arial" w:cs="Arial"/>
+          <w:b/>
+          <w:sz w:val="20"/>
+          <w:szCs w:val="20"/>
+        </w:rPr>
+        <w:t>,</w:t>
+      </w:r>
+      <w:r>
+        <w:rPr>
+          <w:rFonts w:ascii="Arial" w:hAnsi="Arial" w:cs="Arial"/>
+          <w:b/>
+          <w:sz w:val="20"/>
+          <w:szCs w:val="20"/>
+        </w:rPr>
+        <w:t>5</w:t>
+      </w:r>
+      <w:r>
+        <w:rPr>
+          <w:rFonts w:ascii="Arial" w:hAnsi="Arial" w:cs="Arial"/>
+          <w:b/>
+          <w:sz w:val="20"/>
+          <w:szCs w:val="20"/>
+        </w:rPr>
+        <w:t xml:space="preserve"> *Enunciados Indirectos: </w:t>
+      </w:r>
+      <w:r>
+        <w:rPr>
+          <w:rFonts w:ascii="Arial" w:hAnsi="Arial" w:cs="Arial"/>
+          <w:b/>
+          <w:sz w:val="20"/>
+          <w:szCs w:val="20"/>
+        </w:rPr>
+        <w:t>6</w:t>
       </w:r>
     </w:p>
     <w:p>
@@ -2162,7 +1950,7 @@
                 <w:sz w:val="20"/>
                 <w:szCs w:val="20"/>
               </w:rPr>
-              <w:t>Existen accesos erróneos otorgados al personal.</w:t>
+              <w:t>Los permisos de cada personal son otorgados correctamente.</w:t>
             </w:r>
           </w:p>
         </w:tc>
@@ -2185,99 +1973,99 @@
                 <w:sz w:val="20"/>
                 <w:szCs w:val="20"/>
               </w:rPr>
+              <w:t>1</w:t>
+            </w:r>
+          </w:p>
+        </w:tc>
+        <w:tc>
+          <w:tcPr>
+            <w:tcW w:w="650" w:type="dxa"/>
+          </w:tcPr>
+          <w:p>
+            <w:pPr>
+              <w:jc w:val="both"/>
+              <w:rPr>
+                <w:rFonts w:ascii="Arial" w:hAnsi="Arial" w:cs="Arial"/>
+                <w:sz w:val="20"/>
+                <w:szCs w:val="20"/>
+              </w:rPr>
+            </w:pPr>
+            <w:r>
+              <w:rPr>
+                <w:rFonts w:ascii="Arial" w:hAnsi="Arial" w:cs="Arial"/>
+                <w:sz w:val="20"/>
+                <w:szCs w:val="20"/>
+              </w:rPr>
+              <w:t>2</w:t>
+            </w:r>
+          </w:p>
+        </w:tc>
+        <w:tc>
+          <w:tcPr>
+            <w:tcW w:w="494" w:type="dxa"/>
+          </w:tcPr>
+          <w:p>
+            <w:pPr>
+              <w:jc w:val="both"/>
+              <w:rPr>
+                <w:rFonts w:ascii="Arial" w:hAnsi="Arial" w:cs="Arial"/>
+                <w:sz w:val="20"/>
+                <w:szCs w:val="20"/>
+              </w:rPr>
+            </w:pPr>
+            <w:r>
+              <w:rPr>
+                <w:rFonts w:ascii="Arial" w:hAnsi="Arial" w:cs="Arial"/>
+                <w:sz w:val="20"/>
+                <w:szCs w:val="20"/>
+              </w:rPr>
+              <w:t>3</w:t>
+            </w:r>
+          </w:p>
+        </w:tc>
+        <w:tc>
+          <w:tcPr>
+            <w:tcW w:w="494" w:type="dxa"/>
+          </w:tcPr>
+          <w:p>
+            <w:pPr>
+              <w:jc w:val="both"/>
+              <w:rPr>
+                <w:rFonts w:ascii="Arial" w:hAnsi="Arial" w:cs="Arial"/>
+                <w:sz w:val="20"/>
+                <w:szCs w:val="20"/>
+              </w:rPr>
+            </w:pPr>
+            <w:r>
+              <w:rPr>
+                <w:rFonts w:ascii="Arial" w:hAnsi="Arial" w:cs="Arial"/>
+                <w:sz w:val="20"/>
+                <w:szCs w:val="20"/>
+              </w:rPr>
+              <w:t>4</w:t>
+            </w:r>
+          </w:p>
+        </w:tc>
+        <w:tc>
+          <w:tcPr>
+            <w:tcW w:w="413" w:type="dxa"/>
+          </w:tcPr>
+          <w:p>
+            <w:pPr>
+              <w:jc w:val="both"/>
+              <w:rPr>
+                <w:rFonts w:ascii="Arial" w:hAnsi="Arial" w:cs="Arial"/>
+                <w:sz w:val="20"/>
+                <w:szCs w:val="20"/>
+              </w:rPr>
+            </w:pPr>
+            <w:r>
+              <w:rPr>
+                <w:rFonts w:ascii="Arial" w:hAnsi="Arial" w:cs="Arial"/>
+                <w:sz w:val="20"/>
+                <w:szCs w:val="20"/>
+              </w:rPr>
               <w:t>5</w:t>
-            </w:r>
-          </w:p>
-        </w:tc>
-        <w:tc>
-          <w:tcPr>
-            <w:tcW w:w="650" w:type="dxa"/>
-          </w:tcPr>
-          <w:p>
-            <w:pPr>
-              <w:jc w:val="both"/>
-              <w:rPr>
-                <w:rFonts w:ascii="Arial" w:hAnsi="Arial" w:cs="Arial"/>
-                <w:sz w:val="20"/>
-                <w:szCs w:val="20"/>
-              </w:rPr>
-            </w:pPr>
-            <w:r>
-              <w:rPr>
-                <w:rFonts w:ascii="Arial" w:hAnsi="Arial" w:cs="Arial"/>
-                <w:sz w:val="20"/>
-                <w:szCs w:val="20"/>
-              </w:rPr>
-              <w:t>4</w:t>
-            </w:r>
-          </w:p>
-        </w:tc>
-        <w:tc>
-          <w:tcPr>
-            <w:tcW w:w="494" w:type="dxa"/>
-          </w:tcPr>
-          <w:p>
-            <w:pPr>
-              <w:jc w:val="both"/>
-              <w:rPr>
-                <w:rFonts w:ascii="Arial" w:hAnsi="Arial" w:cs="Arial"/>
-                <w:sz w:val="20"/>
-                <w:szCs w:val="20"/>
-              </w:rPr>
-            </w:pPr>
-            <w:r>
-              <w:rPr>
-                <w:rFonts w:ascii="Arial" w:hAnsi="Arial" w:cs="Arial"/>
-                <w:sz w:val="20"/>
-                <w:szCs w:val="20"/>
-              </w:rPr>
-              <w:t>3</w:t>
-            </w:r>
-          </w:p>
-        </w:tc>
-        <w:tc>
-          <w:tcPr>
-            <w:tcW w:w="494" w:type="dxa"/>
-          </w:tcPr>
-          <w:p>
-            <w:pPr>
-              <w:jc w:val="both"/>
-              <w:rPr>
-                <w:rFonts w:ascii="Arial" w:hAnsi="Arial" w:cs="Arial"/>
-                <w:sz w:val="20"/>
-                <w:szCs w:val="20"/>
-              </w:rPr>
-            </w:pPr>
-            <w:r>
-              <w:rPr>
-                <w:rFonts w:ascii="Arial" w:hAnsi="Arial" w:cs="Arial"/>
-                <w:sz w:val="20"/>
-                <w:szCs w:val="20"/>
-              </w:rPr>
-              <w:t>2</w:t>
-            </w:r>
-          </w:p>
-        </w:tc>
-        <w:tc>
-          <w:tcPr>
-            <w:tcW w:w="413" w:type="dxa"/>
-          </w:tcPr>
-          <w:p>
-            <w:pPr>
-              <w:jc w:val="both"/>
-              <w:rPr>
-                <w:rFonts w:ascii="Arial" w:hAnsi="Arial" w:cs="Arial"/>
-                <w:sz w:val="20"/>
-                <w:szCs w:val="20"/>
-              </w:rPr>
-            </w:pPr>
-            <w:r>
-              <w:rPr>
-                <w:rFonts w:ascii="Arial" w:hAnsi="Arial" w:cs="Arial"/>
-                <w:sz w:val="20"/>
-                <w:szCs w:val="20"/>
-              </w:rPr>
-              <w:t>1</w:t>
             </w:r>
           </w:p>
         </w:tc>
@@ -2306,7 +2094,7 @@
                 <w:sz w:val="20"/>
                 <w:szCs w:val="20"/>
               </w:rPr>
-              <w:t>Los permisos de cada personal son otorgados correctamente.</w:t>
+              <w:t>El personal confía en la otorgación correcta de los permisos.</w:t>
             </w:r>
           </w:p>
         </w:tc>
@@ -2450,151 +2238,7 @@
                 <w:sz w:val="20"/>
                 <w:szCs w:val="20"/>
               </w:rPr>
-              <w:t>El personal confía en la otorgación correcta de los permisos.</w:t>
-            </w:r>
-          </w:p>
-        </w:tc>
-        <w:tc>
-          <w:tcPr>
-            <w:tcW w:w="420" w:type="dxa"/>
-          </w:tcPr>
-          <w:p>
-            <w:pPr>
-              <w:jc w:val="both"/>
-              <w:rPr>
-                <w:rFonts w:ascii="Arial" w:hAnsi="Arial" w:cs="Arial"/>
-                <w:sz w:val="20"/>
-                <w:szCs w:val="20"/>
-              </w:rPr>
-            </w:pPr>
-            <w:r>
-              <w:rPr>
-                <w:rFonts w:ascii="Arial" w:hAnsi="Arial" w:cs="Arial"/>
-                <w:sz w:val="20"/>
-                <w:szCs w:val="20"/>
-              </w:rPr>
-              <w:t>1</w:t>
-            </w:r>
-          </w:p>
-        </w:tc>
-        <w:tc>
-          <w:tcPr>
-            <w:tcW w:w="650" w:type="dxa"/>
-          </w:tcPr>
-          <w:p>
-            <w:pPr>
-              <w:jc w:val="both"/>
-              <w:rPr>
-                <w:rFonts w:ascii="Arial" w:hAnsi="Arial" w:cs="Arial"/>
-                <w:sz w:val="20"/>
-                <w:szCs w:val="20"/>
-              </w:rPr>
-            </w:pPr>
-            <w:r>
-              <w:rPr>
-                <w:rFonts w:ascii="Arial" w:hAnsi="Arial" w:cs="Arial"/>
-                <w:sz w:val="20"/>
-                <w:szCs w:val="20"/>
-              </w:rPr>
-              <w:t>2</w:t>
-            </w:r>
-          </w:p>
-        </w:tc>
-        <w:tc>
-          <w:tcPr>
-            <w:tcW w:w="494" w:type="dxa"/>
-          </w:tcPr>
-          <w:p>
-            <w:pPr>
-              <w:jc w:val="both"/>
-              <w:rPr>
-                <w:rFonts w:ascii="Arial" w:hAnsi="Arial" w:cs="Arial"/>
-                <w:sz w:val="20"/>
-                <w:szCs w:val="20"/>
-              </w:rPr>
-            </w:pPr>
-            <w:r>
-              <w:rPr>
-                <w:rFonts w:ascii="Arial" w:hAnsi="Arial" w:cs="Arial"/>
-                <w:sz w:val="20"/>
-                <w:szCs w:val="20"/>
-              </w:rPr>
-              <w:t>3</w:t>
-            </w:r>
-          </w:p>
-        </w:tc>
-        <w:tc>
-          <w:tcPr>
-            <w:tcW w:w="494" w:type="dxa"/>
-          </w:tcPr>
-          <w:p>
-            <w:pPr>
-              <w:jc w:val="both"/>
-              <w:rPr>
-                <w:rFonts w:ascii="Arial" w:hAnsi="Arial" w:cs="Arial"/>
-                <w:sz w:val="20"/>
-                <w:szCs w:val="20"/>
-              </w:rPr>
-            </w:pPr>
-            <w:r>
-              <w:rPr>
-                <w:rFonts w:ascii="Arial" w:hAnsi="Arial" w:cs="Arial"/>
-                <w:sz w:val="20"/>
-                <w:szCs w:val="20"/>
-              </w:rPr>
-              <w:t>4</w:t>
-            </w:r>
-          </w:p>
-        </w:tc>
-        <w:tc>
-          <w:tcPr>
-            <w:tcW w:w="413" w:type="dxa"/>
-          </w:tcPr>
-          <w:p>
-            <w:pPr>
-              <w:jc w:val="both"/>
-              <w:rPr>
-                <w:rFonts w:ascii="Arial" w:hAnsi="Arial" w:cs="Arial"/>
-                <w:sz w:val="20"/>
-                <w:szCs w:val="20"/>
-              </w:rPr>
-            </w:pPr>
-            <w:r>
-              <w:rPr>
-                <w:rFonts w:ascii="Arial" w:hAnsi="Arial" w:cs="Arial"/>
-                <w:sz w:val="20"/>
-                <w:szCs w:val="20"/>
-              </w:rPr>
-              <w:t>5</w:t>
-            </w:r>
-          </w:p>
-        </w:tc>
-      </w:tr>
-      <w:tr>
-        <w:tc>
-          <w:tcPr>
-            <w:tcW w:w="6023" w:type="dxa"/>
-          </w:tcPr>
-          <w:p>
-            <w:pPr>
-              <w:pStyle w:val="Prrafodelista"/>
-              <w:numPr>
-                <w:ilvl w:val="0"/>
-                <w:numId w:val="37"/>
-              </w:numPr>
-              <w:rPr>
-                <w:rFonts w:ascii="Arial" w:hAnsi="Arial" w:cs="Arial"/>
-                <w:sz w:val="20"/>
-                <w:szCs w:val="20"/>
-              </w:rPr>
-            </w:pPr>
-            <w:r>
-              <w:rPr>
-                <w:rFonts w:ascii="Arial" w:hAnsi="Arial" w:cs="Arial"/>
-                <w:sz w:val="20"/>
-                <w:szCs w:val="20"/>
-              </w:rPr>
-              <w:t>Existen fallos en el proceso de autorización del personal.</w:t>
+              <w:t>Existen accesos erróneos otorgados al personal.</w:t>
             </w:r>
           </w:p>
         </w:tc>
@@ -2752,7 +2396,43 @@
           <w:sz w:val="20"/>
           <w:szCs w:val="20"/>
         </w:rPr>
-        <w:t>*Enunciados Directos: 10,11 *Enunciados Indirectos: 9,12</w:t>
+        <w:t xml:space="preserve">*Enunciados Directos: </w:t>
+      </w:r>
+      <w:r>
+        <w:rPr>
+          <w:rFonts w:ascii="Arial" w:hAnsi="Arial" w:cs="Arial"/>
+          <w:b/>
+          <w:sz w:val="20"/>
+          <w:szCs w:val="20"/>
+        </w:rPr>
+        <w:t>7</w:t>
+      </w:r>
+      <w:r>
+        <w:rPr>
+          <w:rFonts w:ascii="Arial" w:hAnsi="Arial" w:cs="Arial"/>
+          <w:b/>
+          <w:sz w:val="20"/>
+          <w:szCs w:val="20"/>
+        </w:rPr>
+        <w:t>,</w:t>
+      </w:r>
+      <w:r>
+        <w:rPr>
+          <w:rFonts w:ascii="Arial" w:hAnsi="Arial" w:cs="Arial"/>
+          <w:b/>
+          <w:sz w:val="20"/>
+          <w:szCs w:val="20"/>
+        </w:rPr>
+        <w:t>8</w:t>
+      </w:r>
+      <w:r>
+        <w:rPr>
+          <w:rFonts w:ascii="Arial" w:hAnsi="Arial" w:cs="Arial"/>
+          <w:b/>
+          <w:sz w:val="20"/>
+          <w:szCs w:val="20"/>
+        </w:rPr>
+        <w:t xml:space="preserve"> *Enunciados Indirectos: 9</w:t>
       </w:r>
     </w:p>
     <w:p>
@@ -3392,7 +3072,6 @@
           <w:sz w:val="20"/>
           <w:szCs w:val="20"/>
         </w:rPr>
-        <w:lastRenderedPageBreak/>
         <w:t>*N: Nunca; MPV: Muy Pocas Veces; AV: Algunas Veces; CS: Casi Siempre; S: Siempre</w:t>
       </w:r>
     </w:p>
@@ -3413,7 +3092,52 @@
           <w:sz w:val="20"/>
           <w:szCs w:val="20"/>
         </w:rPr>
-        <w:t>*Enunciados Directos: 13,14,15</w:t>
+        <w:t>*Enunciados Directos: 1</w:t>
+      </w:r>
+      <w:r>
+        <w:rPr>
+          <w:rFonts w:ascii="Arial" w:hAnsi="Arial" w:cs="Arial"/>
+          <w:b/>
+          <w:sz w:val="20"/>
+          <w:szCs w:val="20"/>
+        </w:rPr>
+        <w:t>0</w:t>
+      </w:r>
+      <w:r>
+        <w:rPr>
+          <w:rFonts w:ascii="Arial" w:hAnsi="Arial" w:cs="Arial"/>
+          <w:b/>
+          <w:sz w:val="20"/>
+          <w:szCs w:val="20"/>
+        </w:rPr>
+        <w:t>,1</w:t>
+      </w:r>
+      <w:r>
+        <w:rPr>
+          <w:rFonts w:ascii="Arial" w:hAnsi="Arial" w:cs="Arial"/>
+          <w:b/>
+          <w:sz w:val="20"/>
+          <w:szCs w:val="20"/>
+        </w:rPr>
+        <w:t>1</w:t>
+      </w:r>
+      <w:r>
+        <w:rPr>
+          <w:rFonts w:ascii="Arial" w:hAnsi="Arial" w:cs="Arial"/>
+          <w:b/>
+          <w:sz w:val="20"/>
+          <w:szCs w:val="20"/>
+        </w:rPr>
+        <w:t>,1</w:t>
+      </w:r>
+      <w:r>
+        <w:rPr>
+          <w:rFonts w:ascii="Arial" w:hAnsi="Arial" w:cs="Arial"/>
+          <w:b/>
+          <w:sz w:val="20"/>
+          <w:szCs w:val="20"/>
+        </w:rPr>
+        <w:t>2</w:t>
       </w:r>
     </w:p>
     <w:tbl>
@@ -3451,6 +3175,7 @@
                 <w:sz w:val="20"/>
                 <w:szCs w:val="20"/>
               </w:rPr>
+              <w:lastRenderedPageBreak/>
               <w:t>DICCIONARIO DE CONCEPTOS</w:t>
             </w:r>
           </w:p>
@@ -3720,7 +3445,39 @@
                 <w:sz w:val="20"/>
                 <w:szCs w:val="20"/>
               </w:rPr>
-              <w:t>Proceso donde el equipo o método de control de acceso autentica la identidad de la persona.</w:t>
+              <w:t>Proceso donde el equipo o método de control de acceso autentica la identidad de la persona</w:t>
+            </w:r>
+            <w:r>
+              <w:rPr>
+                <w:rFonts w:ascii="Arial" w:hAnsi="Arial" w:cs="Arial"/>
+                <w:sz w:val="20"/>
+                <w:szCs w:val="20"/>
+              </w:rPr>
+              <w:t xml:space="preserve"> </w:t>
+            </w:r>
+            <w:r>
+              <w:rPr>
+                <w:rFonts w:ascii="Arial" w:hAnsi="Arial" w:cs="Arial"/>
+                <w:sz w:val="20"/>
+                <w:szCs w:val="20"/>
+              </w:rPr>
+              <w:t>según</w:t>
+            </w:r>
+            <w:r>
+              <w:rPr>
+                <w:rFonts w:ascii="Arial" w:hAnsi="Arial" w:cs="Arial"/>
+                <w:sz w:val="20"/>
+                <w:szCs w:val="20"/>
+              </w:rPr>
+              <w:t xml:space="preserve"> su identificación presentada</w:t>
+            </w:r>
+            <w:r>
+              <w:rPr>
+                <w:rFonts w:ascii="Arial" w:hAnsi="Arial" w:cs="Arial"/>
+                <w:sz w:val="20"/>
+                <w:szCs w:val="20"/>
+              </w:rPr>
+              <w:t>.</w:t>
             </w:r>
           </w:p>
         </w:tc>
@@ -3746,7 +3503,7 @@
                 <w:sz w:val="20"/>
                 <w:szCs w:val="20"/>
               </w:rPr>
-              <w:t>Autorización</w:t>
+              <w:t>Falso Positivo</w:t>
             </w:r>
           </w:p>
         </w:tc>
@@ -3769,7 +3526,7 @@
                 <w:sz w:val="20"/>
                 <w:szCs w:val="20"/>
               </w:rPr>
-              <w:t>Proceso donde, en base a la autenticación de la persona, se otorgan los accesos respectivos.</w:t>
+              <w:t>Proceso donde el personal no identificado (fraudulento) es autenticado por resultado de alguna falla en el equipo o herramienta de control de acceso, suplantando la identidad de otra persona.</w:t>
             </w:r>
           </w:p>
         </w:tc>
@@ -3795,6 +3552,55 @@
                 <w:sz w:val="20"/>
                 <w:szCs w:val="20"/>
               </w:rPr>
+              <w:t>Autorización</w:t>
+            </w:r>
+          </w:p>
+        </w:tc>
+        <w:tc>
+          <w:tcPr>
+            <w:tcW w:w="6514" w:type="dxa"/>
+          </w:tcPr>
+          <w:p>
+            <w:pPr>
+              <w:jc w:val="both"/>
+              <w:rPr>
+                <w:rFonts w:ascii="Arial" w:hAnsi="Arial" w:cs="Arial"/>
+                <w:sz w:val="20"/>
+                <w:szCs w:val="20"/>
+              </w:rPr>
+            </w:pPr>
+            <w:r>
+              <w:rPr>
+                <w:rFonts w:ascii="Arial" w:hAnsi="Arial" w:cs="Arial"/>
+                <w:sz w:val="20"/>
+                <w:szCs w:val="20"/>
+              </w:rPr>
+              <w:t>Proceso donde, en base a la autenticación de la persona, se otorgan los accesos respectivos.</w:t>
+            </w:r>
+          </w:p>
+        </w:tc>
+      </w:tr>
+      <w:tr>
+        <w:tc>
+          <w:tcPr>
+            <w:tcW w:w="1980" w:type="dxa"/>
+            <w:vAlign w:val="center"/>
+          </w:tcPr>
+          <w:p>
+            <w:pPr>
+              <w:jc w:val="center"/>
+              <w:rPr>
+                <w:rFonts w:ascii="Arial" w:hAnsi="Arial" w:cs="Arial"/>
+                <w:sz w:val="20"/>
+                <w:szCs w:val="20"/>
+              </w:rPr>
+            </w:pPr>
+            <w:r>
+              <w:rPr>
+                <w:rFonts w:ascii="Arial" w:hAnsi="Arial" w:cs="Arial"/>
+                <w:sz w:val="20"/>
+                <w:szCs w:val="20"/>
+              </w:rPr>
               <w:t>Trazabilidad</w:t>
             </w:r>
           </w:p>
@@ -3818,23 +3624,7 @@
                 <w:sz w:val="20"/>
                 <w:szCs w:val="20"/>
               </w:rPr>
-              <w:t>Proceso donde se registra la bitácora de todas las acciones dadas durante el control de acceso (</w:t>
-            </w:r>
-            <w:r>
-              <w:rPr>
-                <w:rFonts w:ascii="Arial" w:hAnsi="Arial" w:cs="Arial"/>
-                <w:sz w:val="20"/>
-                <w:szCs w:val="20"/>
-              </w:rPr>
-              <w:t>registro de accesos denegados, concedidos, etc. T</w:t>
-            </w:r>
-            <w:r>
-              <w:rPr>
-                <w:rFonts w:ascii="Arial" w:hAnsi="Arial" w:cs="Arial"/>
-                <w:sz w:val="20"/>
-                <w:szCs w:val="20"/>
-              </w:rPr>
-              <w:t>ales registros pueden ser visualizados en reportes).</w:t>
+              <w:t>Proceso donde se registra la bitácora de todas las acciones dadas durante el control de acceso (registro de accesos denegados, concedidos, etc. Tales registros pueden ser visualizados en reportes, logs, historiales).</w:t>
             </w:r>
           </w:p>
         </w:tc>
@@ -4006,7 +3796,21 @@
           <w:rFonts w:ascii="Arial" w:hAnsi="Arial" w:cs="Arial"/>
           <w:i/>
         </w:rPr>
-        <w:t>al área de Tesorería del Gobierno Regional de Tacna.</w:t>
+        <w:t xml:space="preserve">al </w:t>
+      </w:r>
+      <w:r>
+        <w:rPr>
+          <w:rFonts w:ascii="Arial" w:hAnsi="Arial" w:cs="Arial"/>
+          <w:i/>
+        </w:rPr>
+        <w:t xml:space="preserve">almacén del </w:t>
+      </w:r>
+      <w:r>
+        <w:rPr>
+          <w:rFonts w:ascii="Arial" w:hAnsi="Arial" w:cs="Arial"/>
+          <w:i/>
+        </w:rPr>
+        <w:t>área de Tesorería del Gobierno Regional de Tacna.</w:t>
       </w:r>
     </w:p>
     <w:p>

</xml_diff>